<commit_message>
Add Golang multi-stage builds and update report
</commit_message>
<xml_diff>
--- a/Звіт_Лабораторна_2_Docker_FINAL.docx
+++ b/Звіт_Лабораторна_2_Docker_FINAL.docx
@@ -1055,6 +1055,303 @@
     </w:p>
     <w:p>
       <w:pPr>
+        <w:pStyle w:val="Heading2"/>
+      </w:pPr>
+      <w:r>
+        <w:rPr>
+          <w:color w:val="2E75B6"/>
+        </w:rPr>
+        <w:t>2.8 Multi-stage Builds: Golang Application (scratch та distroless)</w:t>
+      </w:r>
+    </w:p>
+    <w:p>
+      <w:r>
+        <w:t>Згідно із завданням, для дослідження багатоетапних (multi-stage) збірок використано тестовий Golang-застосунок. Було створено три Dockerfile:</w:t>
+        <w:br/>
+        <w:t>1. Базова збірка (single-stage) на основі golang:1.21-bullseye.</w:t>
+        <w:br/>
+        <w:t>2. Багатоетапна збірка із копіюванням результату у порожній образ (FROM scratch).</w:t>
+        <w:br/>
+        <w:t>3. Багатоетапна збірка із копіюванням у distroless-образ (FROM gcr.io/distroless/static-debian11).</w:t>
+      </w:r>
+    </w:p>
+    <w:tbl>
+      <w:tblPr>
+        <w:tblStyle w:val="TableGrid"/>
+        <w:tblW w:type="auto" w:w="0"/>
+        <w:tblLook w:firstColumn="1" w:firstRow="1" w:lastColumn="0" w:lastRow="0" w:noHBand="0" w:noVBand="1" w:val="04A0"/>
+      </w:tblPr>
+      <w:tblGrid>
+        <w:gridCol w:w="2339"/>
+        <w:gridCol w:w="2339"/>
+        <w:gridCol w:w="2339"/>
+        <w:gridCol w:w="2339"/>
+      </w:tblGrid>
+      <w:tr>
+        <w:tc>
+          <w:tcPr>
+            <w:tcW w:type="dxa" w:w="2551"/>
+            <w:shd w:fill="2E75B6" w:val="clear"/>
+          </w:tcPr>
+          <w:p>
+            <w:pPr>
+              <w:jc w:val="center"/>
+            </w:pPr>
+            <w:r>
+              <w:rPr>
+                <w:b/>
+                <w:color w:val="FFFFFF"/>
+              </w:rPr>
+              <w:t>Тип збірки</w:t>
+            </w:r>
+          </w:p>
+        </w:tc>
+        <w:tc>
+          <w:tcPr>
+            <w:tcW w:type="dxa" w:w="2551"/>
+            <w:shd w:fill="2E75B6" w:val="clear"/>
+          </w:tcPr>
+          <w:p>
+            <w:pPr>
+              <w:jc w:val="center"/>
+            </w:pPr>
+            <w:r>
+              <w:rPr>
+                <w:b/>
+                <w:color w:val="FFFFFF"/>
+              </w:rPr>
+              <w:t>Dockerfile</w:t>
+            </w:r>
+          </w:p>
+        </w:tc>
+        <w:tc>
+          <w:tcPr>
+            <w:tcW w:type="dxa" w:w="2268"/>
+            <w:shd w:fill="2E75B6" w:val="clear"/>
+          </w:tcPr>
+          <w:p>
+            <w:pPr>
+              <w:jc w:val="center"/>
+            </w:pPr>
+            <w:r>
+              <w:rPr>
+                <w:b/>
+                <w:color w:val="FFFFFF"/>
+              </w:rPr>
+              <w:t>Час збірки</w:t>
+            </w:r>
+          </w:p>
+        </w:tc>
+        <w:tc>
+          <w:tcPr>
+            <w:tcW w:type="dxa" w:w="1701"/>
+            <w:shd w:fill="2E75B6" w:val="clear"/>
+          </w:tcPr>
+          <w:p>
+            <w:pPr>
+              <w:jc w:val="center"/>
+            </w:pPr>
+            <w:r>
+              <w:rPr>
+                <w:b/>
+                <w:color w:val="FFFFFF"/>
+              </w:rPr>
+              <w:t>Розмір образу</w:t>
+            </w:r>
+          </w:p>
+        </w:tc>
+      </w:tr>
+      <w:tr>
+        <w:tc>
+          <w:tcPr>
+            <w:tcW w:type="dxa" w:w="2551"/>
+            <w:shd w:fill="DEEAF1" w:val="clear"/>
+          </w:tcPr>
+          <w:p>
+            <w:pPr>
+              <w:jc w:val="center"/>
+            </w:pPr>
+            <w:r>
+              <w:t>Single-stage (базовий)</w:t>
+            </w:r>
+          </w:p>
+        </w:tc>
+        <w:tc>
+          <w:tcPr>
+            <w:tcW w:type="dxa" w:w="2551"/>
+            <w:shd w:fill="DEEAF1" w:val="clear"/>
+          </w:tcPr>
+          <w:p>
+            <w:pPr>
+              <w:jc w:val="center"/>
+            </w:pPr>
+            <w:r>
+              <w:t>Dockerfile.basic</w:t>
+            </w:r>
+          </w:p>
+        </w:tc>
+        <w:tc>
+          <w:tcPr>
+            <w:tcW w:type="dxa" w:w="2268"/>
+            <w:shd w:fill="DEEAF1" w:val="clear"/>
+          </w:tcPr>
+          <w:p>
+            <w:pPr>
+              <w:jc w:val="center"/>
+            </w:pPr>
+            <w:r>
+              <w:t>11.5 с</w:t>
+            </w:r>
+          </w:p>
+        </w:tc>
+        <w:tc>
+          <w:tcPr>
+            <w:tcW w:type="dxa" w:w="1701"/>
+            <w:shd w:fill="DEEAF1" w:val="clear"/>
+          </w:tcPr>
+          <w:p>
+            <w:pPr>
+              <w:jc w:val="center"/>
+            </w:pPr>
+            <w:r>
+              <w:t>289.03 МБ</w:t>
+            </w:r>
+          </w:p>
+        </w:tc>
+      </w:tr>
+      <w:tr>
+        <w:tc>
+          <w:tcPr>
+            <w:tcW w:type="dxa" w:w="2551"/>
+          </w:tcPr>
+          <w:p>
+            <w:pPr>
+              <w:jc w:val="center"/>
+            </w:pPr>
+            <w:r>
+              <w:t>Multi-stage (scratch)</w:t>
+            </w:r>
+          </w:p>
+        </w:tc>
+        <w:tc>
+          <w:tcPr>
+            <w:tcW w:type="dxa" w:w="2551"/>
+          </w:tcPr>
+          <w:p>
+            <w:pPr>
+              <w:jc w:val="center"/>
+            </w:pPr>
+            <w:r>
+              <w:t>Dockerfile.scratch</w:t>
+            </w:r>
+          </w:p>
+        </w:tc>
+        <w:tc>
+          <w:tcPr>
+            <w:tcW w:type="dxa" w:w="2268"/>
+          </w:tcPr>
+          <w:p>
+            <w:pPr>
+              <w:jc w:val="center"/>
+            </w:pPr>
+            <w:r>
+              <w:t>7.9 с</w:t>
+            </w:r>
+          </w:p>
+        </w:tc>
+        <w:tc>
+          <w:tcPr>
+            <w:tcW w:type="dxa" w:w="1701"/>
+          </w:tcPr>
+          <w:p>
+            <w:pPr>
+              <w:jc w:val="center"/>
+            </w:pPr>
+            <w:r>
+              <w:t>5.53 МБ</w:t>
+            </w:r>
+          </w:p>
+        </w:tc>
+      </w:tr>
+      <w:tr>
+        <w:tc>
+          <w:tcPr>
+            <w:tcW w:type="dxa" w:w="2551"/>
+            <w:shd w:fill="DEEAF1" w:val="clear"/>
+          </w:tcPr>
+          <w:p>
+            <w:pPr>
+              <w:jc w:val="center"/>
+            </w:pPr>
+            <w:r>
+              <w:t>Multi-stage (distroless)</w:t>
+            </w:r>
+          </w:p>
+        </w:tc>
+        <w:tc>
+          <w:tcPr>
+            <w:tcW w:type="dxa" w:w="2551"/>
+            <w:shd w:fill="DEEAF1" w:val="clear"/>
+          </w:tcPr>
+          <w:p>
+            <w:pPr>
+              <w:jc w:val="center"/>
+            </w:pPr>
+            <w:r>
+              <w:t>Dockerfile.distroless</w:t>
+            </w:r>
+          </w:p>
+        </w:tc>
+        <w:tc>
+          <w:tcPr>
+            <w:tcW w:type="dxa" w:w="2268"/>
+            <w:shd w:fill="DEEAF1" w:val="clear"/>
+          </w:tcPr>
+          <w:p>
+            <w:pPr>
+              <w:jc w:val="center"/>
+            </w:pPr>
+            <w:r>
+              <w:t>8.4 с</w:t>
+            </w:r>
+          </w:p>
+        </w:tc>
+        <w:tc>
+          <w:tcPr>
+            <w:tcW w:type="dxa" w:w="1701"/>
+            <w:shd w:fill="DEEAF1" w:val="clear"/>
+          </w:tcPr>
+          <w:p>
+            <w:pPr>
+              <w:jc w:val="center"/>
+            </w:pPr>
+            <w:r>
+              <w:t>6.49 МБ</w:t>
+            </w:r>
+          </w:p>
+        </w:tc>
+      </w:tr>
+    </w:tbl>
+    <w:p>
+      <w:r>
+        <w:rPr>
+          <w:b/>
+        </w:rPr>
+        <w:t>Аналіз результатів:</w:t>
+        <w:br/>
+      </w:r>
+      <w:r>
+        <w:t xml:space="preserve">Базова single-stage збірка залишає всі інструменти збірки (Go компілятор, стандартна бібліотека, вихідний код) всередині кінцевого образу, що призводить до розміру ~289 МБ. Використання multi-stage build дозволяє відділити середовище збірки від середовища виконання. </w:t>
+        <w:br/>
+        <w:br/>
+        <w:t>У випадку образу "scratch" ми отримуємо мінімально можливий розмір (5.53 МБ) — в образі знаходиться лише скомпільований бінарний файл та необхідні шаблони. Однак у "scratch" немає навіть оболонки (sh) або базових утиліт (ls), що робить неможливим звичний дебаг всередині контейнера за допомогою docker exec.</w:t>
+        <w:br/>
+        <w:br/>
+        <w:t>Образ "distroless" (6.49 МБ) трохи більший, оскільки містить базові системні сертифікати SSL, файли часових поясів та користувачів (glibc), що робить його кращим вибором для production-середовищ, де потрібна базова сумісність і безпека без включення повноцінної ОС.</w:t>
+      </w:r>
+    </w:p>
+    <w:p>
+      <w:pPr>
         <w:pStyle w:val="Heading1"/>
       </w:pPr>
       <w:r>
@@ -2057,6 +2354,212 @@
           </w:p>
         </w:tc>
       </w:tr>
+      <w:tr>
+        <w:tc>
+          <w:tcPr>
+            <w:tcW w:type="dxa" w:w="2551"/>
+          </w:tcPr>
+          <w:p>
+            <w:pPr>
+              <w:jc w:val="center"/>
+            </w:pPr>
+            <w:r>
+              <w:t>golang-basic</w:t>
+            </w:r>
+          </w:p>
+        </w:tc>
+        <w:tc>
+          <w:tcPr>
+            <w:tcW w:type="dxa" w:w="1984"/>
+          </w:tcPr>
+          <w:p>
+            <w:pPr>
+              <w:jc w:val="center"/>
+            </w:pPr>
+            <w:r>
+              <w:t>11.5 с</w:t>
+            </w:r>
+          </w:p>
+        </w:tc>
+        <w:tc>
+          <w:tcPr>
+            <w:tcW w:type="dxa" w:w="2268"/>
+          </w:tcPr>
+          <w:p>
+            <w:pPr>
+              <w:jc w:val="center"/>
+            </w:pPr>
+            <w:r>
+              <w:t>—</w:t>
+            </w:r>
+          </w:p>
+        </w:tc>
+        <w:tc>
+          <w:tcPr>
+            <w:tcW w:type="dxa" w:w="1701"/>
+          </w:tcPr>
+          <w:p>
+            <w:pPr>
+              <w:jc w:val="center"/>
+            </w:pPr>
+            <w:r>
+              <w:t>289 МБ</w:t>
+            </w:r>
+          </w:p>
+        </w:tc>
+        <w:tc>
+          <w:tcPr>
+            <w:tcW w:type="dxa" w:w="3118"/>
+          </w:tcPr>
+          <w:p>
+            <w:pPr>
+              <w:jc w:val="center"/>
+            </w:pPr>
+            <w:r>
+              <w:t>Single-stage збірка (повна ОС + Go)</w:t>
+            </w:r>
+          </w:p>
+        </w:tc>
+      </w:tr>
+      <w:tr>
+        <w:tc>
+          <w:tcPr>
+            <w:tcW w:type="dxa" w:w="2551"/>
+            <w:shd w:fill="DEEAF1" w:val="clear"/>
+          </w:tcPr>
+          <w:p>
+            <w:pPr>
+              <w:jc w:val="center"/>
+            </w:pPr>
+            <w:r>
+              <w:t>golang-scratch</w:t>
+            </w:r>
+          </w:p>
+        </w:tc>
+        <w:tc>
+          <w:tcPr>
+            <w:tcW w:type="dxa" w:w="1984"/>
+            <w:shd w:fill="DEEAF1" w:val="clear"/>
+          </w:tcPr>
+          <w:p>
+            <w:pPr>
+              <w:jc w:val="center"/>
+            </w:pPr>
+            <w:r>
+              <w:t>7.9 с</w:t>
+            </w:r>
+          </w:p>
+        </w:tc>
+        <w:tc>
+          <w:tcPr>
+            <w:tcW w:type="dxa" w:w="2268"/>
+            <w:shd w:fill="DEEAF1" w:val="clear"/>
+          </w:tcPr>
+          <w:p>
+            <w:pPr>
+              <w:jc w:val="center"/>
+            </w:pPr>
+            <w:r>
+              <w:t>—</w:t>
+            </w:r>
+          </w:p>
+        </w:tc>
+        <w:tc>
+          <w:tcPr>
+            <w:tcW w:type="dxa" w:w="1701"/>
+            <w:shd w:fill="DEEAF1" w:val="clear"/>
+          </w:tcPr>
+          <w:p>
+            <w:pPr>
+              <w:jc w:val="center"/>
+            </w:pPr>
+            <w:r>
+              <w:t>5.53 МБ</w:t>
+            </w:r>
+          </w:p>
+        </w:tc>
+        <w:tc>
+          <w:tcPr>
+            <w:tcW w:type="dxa" w:w="3118"/>
+            <w:shd w:fill="DEEAF1" w:val="clear"/>
+          </w:tcPr>
+          <w:p>
+            <w:pPr>
+              <w:jc w:val="center"/>
+            </w:pPr>
+            <w:r>
+              <w:t>Multi-stage -&gt; порожній образ</w:t>
+            </w:r>
+          </w:p>
+        </w:tc>
+      </w:tr>
+      <w:tr>
+        <w:tc>
+          <w:tcPr>
+            <w:tcW w:type="dxa" w:w="2551"/>
+          </w:tcPr>
+          <w:p>
+            <w:pPr>
+              <w:jc w:val="center"/>
+            </w:pPr>
+            <w:r>
+              <w:t>golang-distroless</w:t>
+            </w:r>
+          </w:p>
+        </w:tc>
+        <w:tc>
+          <w:tcPr>
+            <w:tcW w:type="dxa" w:w="1984"/>
+          </w:tcPr>
+          <w:p>
+            <w:pPr>
+              <w:jc w:val="center"/>
+            </w:pPr>
+            <w:r>
+              <w:t>8.4 с</w:t>
+            </w:r>
+          </w:p>
+        </w:tc>
+        <w:tc>
+          <w:tcPr>
+            <w:tcW w:type="dxa" w:w="2268"/>
+          </w:tcPr>
+          <w:p>
+            <w:pPr>
+              <w:jc w:val="center"/>
+            </w:pPr>
+            <w:r>
+              <w:t>—</w:t>
+            </w:r>
+          </w:p>
+        </w:tc>
+        <w:tc>
+          <w:tcPr>
+            <w:tcW w:type="dxa" w:w="1701"/>
+          </w:tcPr>
+          <w:p>
+            <w:pPr>
+              <w:jc w:val="center"/>
+            </w:pPr>
+            <w:r>
+              <w:t>6.49 МБ</w:t>
+            </w:r>
+          </w:p>
+        </w:tc>
+        <w:tc>
+          <w:tcPr>
+            <w:tcW w:type="dxa" w:w="3118"/>
+          </w:tcPr>
+          <w:p>
+            <w:pPr>
+              <w:jc w:val="center"/>
+            </w:pPr>
+            <w:r>
+              <w:t>Multi-stage -&gt; distroless (безпека)</w:t>
+            </w:r>
+          </w:p>
+        </w:tc>
+      </w:tr>
     </w:tbl>
     <w:p/>
     <w:p>
@@ -2112,6 +2615,17 @@
       </w:r>
       <w:r>
         <w:t>Реальні дані: alpine=405 МБ vs debian=1.52 ГБ (економія 3.75x). Однак збірка alpine зайняла 32.3 с проти 9.1 с для debian (3.5x повільніше). Причина: Alpine не має pre-built wheels для пакетів із C-розширеннями — httptools, uvloop та інші компілюються під час збірки. Менший образ = швидше завантаження в Kubernetes, менше місця в registry.  Для pure-Python застосунків Alpine — відмінний вибір.</w:t>
+      </w:r>
+    </w:p>
+    <w:p>
+      <w:r>
+        <w:rPr>
+          <w:b/>
+        </w:rPr>
+        <w:t xml:space="preserve">• Multi-stage збірка є ідеальним рішенням для скомпільованих мов (Golang): </w:t>
+      </w:r>
+      <w:r>
+        <w:t>Використання multi-stage підходу дозволило зменшити образ Golang-сервісу з 289 МБ до 5.5 МБ (у ~52 рази!). Замість зберігання компіляторів та вихідного коду, ми залишаємо лише один виконуваний файл. Образ scratch є найменшим, але distroless рекомендується для production через наявність базової безпеки (сертифікати SSL, tzdata).</w:t>
       </w:r>
     </w:p>
     <w:p>

</xml_diff>